<commit_message>
docs: Update "A Template-Based Website Builder" document across PDF, DOCX, and ODT formats.
</commit_message>
<xml_diff>
--- a/docs/A Template-Based Website Builder.docx
+++ b/docs/A Template-Based Website Builder.docx
@@ -1096,7 +1096,7 @@
           <v:shape id="ole_rId4" type="_x0000_tole_rId4" style="width:530.3pt;height:587.35pt;mso-wrap-distance-right:0pt;mso-wrap-distance-bottom:8pt" filled="f" o:ole="">
             <v:imagedata r:id="rId5" o:title=""/>
           </v:shape>
-          <o:OLEObject Type="Embed" ProgID="Word.Document.12" ShapeID="ole_rId4" DrawAspect="Content" ObjectID="_843404019" r:id="rId4"/>
+          <o:OLEObject Type="Embed" ProgID="Word.Document.12" ShapeID="ole_rId4" DrawAspect="Content" ObjectID="_1121660329" r:id="rId4"/>
         </w:object>
       </w:r>
     </w:p>
@@ -15265,23 +15265,24 @@
         <w:pStyle w:val="Normal"/>
         <w:jc w:val="center"/>
         <w:rPr>
+          <w:sz w:val="40"/>
+          <w:szCs w:val="32"/>
+        </w:rPr>
+      </w:pPr>
+      <w:r>
+        <w:rPr>
           <w:color w:val="000000"/>
           <w:sz w:val="40"/>
           <w:szCs w:val="32"/>
         </w:rPr>
-      </w:pPr>
-      <w:r>
-        <w:rPr>
-          <w:color w:val="000000"/>
-          <w:sz w:val="40"/>
-          <w:szCs w:val="32"/>
-        </w:rPr>
         <w:t>REFERENCES</w:t>
       </w:r>
     </w:p>
     <w:p>
       <w:pPr>
-        <w:pStyle w:val="Normal"/>
+        <w:pStyle w:val="BodyText"/>
+        <w:bidi w:val="0"/>
+        <w:spacing w:lineRule="auto" w:line="276"/>
         <w:jc w:val="both"/>
         <w:rPr>
           <w:sz w:val="24"/>
@@ -15293,11 +15294,29 @@
           <w:sz w:val="24"/>
           <w:szCs w:val="24"/>
         </w:rPr>
-      </w:r>
-    </w:p>
-    <w:p>
-      <w:pPr>
-        <w:pStyle w:val="Normal"/>
+        <w:t xml:space="preserve">[1] E. Brown, </w:t>
+      </w:r>
+      <w:r>
+        <w:rPr>
+          <w:i/>
+          <w:sz w:val="24"/>
+          <w:szCs w:val="24"/>
+        </w:rPr>
+        <w:t>Web Development with Node and Express: Leveraging the JavaScript Stack</w:t>
+      </w:r>
+      <w:r>
+        <w:rPr>
+          <w:sz w:val="24"/>
+          <w:szCs w:val="24"/>
+        </w:rPr>
+        <w:t>, 2nd ed. Sebastopol, CA, USA: O'Reilly Media, 2019.</w:t>
+      </w:r>
+    </w:p>
+    <w:p>
+      <w:pPr>
+        <w:pStyle w:val="BodyText"/>
+        <w:bidi w:val="0"/>
+        <w:spacing w:lineRule="auto" w:line="276"/>
         <w:jc w:val="both"/>
         <w:rPr>
           <w:sz w:val="24"/>
@@ -15309,12 +15328,28 @@
           <w:sz w:val="24"/>
           <w:szCs w:val="24"/>
         </w:rPr>
-        <w:t>[1] E. Brown, Web Development with Node and Express: Leveraging the JavaScript Stack, 2nd ed. Sebastopol, CA: O'Reilly Media, 2019.</w:t>
-      </w:r>
-    </w:p>
-    <w:p>
-      <w:pPr>
-        <w:pStyle w:val="Normal"/>
+        <w:t xml:space="preserve">[2] J. Duckett, </w:t>
+      </w:r>
+      <w:r>
+        <w:rPr>
+          <w:i/>
+          <w:sz w:val="24"/>
+          <w:szCs w:val="24"/>
+        </w:rPr>
+        <w:t>HTML and CSS: Design and Build Websites</w:t>
+      </w:r>
+      <w:r>
+        <w:rPr>
+          <w:sz w:val="24"/>
+          <w:szCs w:val="24"/>
+        </w:rPr>
+        <w:t>, 1st ed. Indianapolis, IN, USA: Wiley, 2011.</w:t>
+      </w:r>
+    </w:p>
+    <w:p>
+      <w:pPr>
+        <w:pStyle w:val="BodyText"/>
+        <w:spacing w:lineRule="auto" w:line="276"/>
         <w:jc w:val="both"/>
         <w:rPr>
           <w:sz w:val="24"/>
@@ -15326,12 +15361,28 @@
           <w:sz w:val="24"/>
           <w:szCs w:val="24"/>
         </w:rPr>
-        <w:t>[2] J. Duckett, HTML and CSS: Design and Build Websites, 1st ed. Indianapolis, IN: Wiley, 2011.</w:t>
-      </w:r>
-    </w:p>
-    <w:p>
-      <w:pPr>
-        <w:pStyle w:val="Normal"/>
+        <w:t xml:space="preserve">[3] E. A. Meyer and E. Weyl, </w:t>
+      </w:r>
+      <w:r>
+        <w:rPr>
+          <w:i/>
+          <w:sz w:val="24"/>
+          <w:szCs w:val="24"/>
+        </w:rPr>
+        <w:t>CSS: The Definitive Guide</w:t>
+      </w:r>
+      <w:r>
+        <w:rPr>
+          <w:sz w:val="24"/>
+          <w:szCs w:val="24"/>
+        </w:rPr>
+        <w:t>, 4th ed. Sebastopol, CA, USA: O'Reilly Media, 2017.</w:t>
+      </w:r>
+    </w:p>
+    <w:p>
+      <w:pPr>
+        <w:pStyle w:val="BodyText"/>
+        <w:spacing w:lineRule="auto" w:line="276"/>
         <w:jc w:val="both"/>
         <w:rPr>
           <w:sz w:val="24"/>
@@ -15343,12 +15394,28 @@
           <w:sz w:val="24"/>
           <w:szCs w:val="24"/>
         </w:rPr>
-        <w:t>[3] E. A. Meyer and E. Weyl, CSS: The Definitive Guide, 4th ed. Sebastopol, CA: O'Reilly Media, 2017.</w:t>
-      </w:r>
-    </w:p>
-    <w:p>
-      <w:pPr>
-        <w:pStyle w:val="Normal"/>
+        <w:t xml:space="preserve">[4] V. M. Ganeshan, "Web Development Using ReactJS," in </w:t>
+      </w:r>
+      <w:r>
+        <w:rPr>
+          <w:i/>
+          <w:sz w:val="24"/>
+          <w:szCs w:val="24"/>
+        </w:rPr>
+        <w:t>Proc. 5th Int. Conf. Adv. Comput., Commun. Control Netw. (ICAC3N)</w:t>
+      </w:r>
+      <w:r>
+        <w:rPr>
+          <w:sz w:val="24"/>
+          <w:szCs w:val="24"/>
+        </w:rPr>
+        <w:t>, 2023, pp. 1–5.</w:t>
+      </w:r>
+    </w:p>
+    <w:p>
+      <w:pPr>
+        <w:pStyle w:val="BodyText"/>
+        <w:spacing w:lineRule="auto" w:line="276"/>
         <w:jc w:val="both"/>
         <w:rPr>
           <w:sz w:val="24"/>
@@ -15360,12 +15427,28 @@
           <w:sz w:val="24"/>
           <w:szCs w:val="24"/>
         </w:rPr>
-        <w:t>[4] V. M. Ganeshan, "Web Development Using ReactJS," 2023 5th International Conference on Advances in Computing, Communication Control and Networking (ICAC3N), 2023, pp. 1-5.</w:t>
-      </w:r>
-    </w:p>
-    <w:p>
-      <w:pPr>
-        <w:pStyle w:val="Normal"/>
+        <w:t xml:space="preserve">[5] S. Tilkov and S. Vinoski, "Node.js: Using JavaScript to Build High-Performance Network Programs," </w:t>
+      </w:r>
+      <w:r>
+        <w:rPr>
+          <w:i/>
+          <w:sz w:val="24"/>
+          <w:szCs w:val="24"/>
+        </w:rPr>
+        <w:t>IEEE Internet Comput.</w:t>
+      </w:r>
+      <w:r>
+        <w:rPr>
+          <w:sz w:val="24"/>
+          <w:szCs w:val="24"/>
+        </w:rPr>
+        <w:t>, vol. 14, no. 6, pp. 80–83, Nov.–Dec. 2010.</w:t>
+      </w:r>
+    </w:p>
+    <w:p>
+      <w:pPr>
+        <w:pStyle w:val="BodyText"/>
+        <w:spacing w:lineRule="auto" w:line="276"/>
         <w:jc w:val="both"/>
         <w:rPr>
           <w:sz w:val="24"/>
@@ -15377,12 +15460,28 @@
           <w:sz w:val="24"/>
           <w:szCs w:val="24"/>
         </w:rPr>
-        <w:t>[5] S. Tilkov and S. Vinoski, "Node.js: Using JavaScript to Build High-Performance Network Programs," IEEE Internet Computing, vol. 14, no. 6, pp. 80-83, Nov.-Dec. 2010.</w:t>
-      </w:r>
-    </w:p>
-    <w:p>
-      <w:pPr>
-        <w:pStyle w:val="Normal"/>
+        <w:t xml:space="preserve">[6] A. Banks and E. Porcello, </w:t>
+      </w:r>
+      <w:r>
+        <w:rPr>
+          <w:i/>
+          <w:sz w:val="24"/>
+          <w:szCs w:val="24"/>
+        </w:rPr>
+        <w:t>Learning React: Modern Patterns for Developing React Apps</w:t>
+      </w:r>
+      <w:r>
+        <w:rPr>
+          <w:sz w:val="24"/>
+          <w:szCs w:val="24"/>
+        </w:rPr>
+        <w:t>, 2nd ed. Sebastopol, CA, USA: O'Reilly Media, 2020.</w:t>
+      </w:r>
+    </w:p>
+    <w:p>
+      <w:pPr>
+        <w:pStyle w:val="BodyText"/>
+        <w:spacing w:lineRule="auto" w:line="276"/>
         <w:jc w:val="both"/>
         <w:rPr>
           <w:sz w:val="24"/>
@@ -15394,12 +15493,28 @@
           <w:sz w:val="24"/>
           <w:szCs w:val="24"/>
         </w:rPr>
-        <w:t>[6] A. Banks and E. Porcello, Learning React: Modern Patterns for Developing React Apps, 2nd ed. Sebastopol, CA: O'Reilly Media, 2020.</w:t>
-      </w:r>
-    </w:p>
-    <w:p>
-      <w:pPr>
-        <w:pStyle w:val="Normal"/>
+        <w:t xml:space="preserve">[7] Y. Li and S. Manoharan, "A performance comparison of SQL and NoSQL databases," in </w:t>
+      </w:r>
+      <w:r>
+        <w:rPr>
+          <w:i/>
+          <w:sz w:val="24"/>
+          <w:szCs w:val="24"/>
+        </w:rPr>
+        <w:t>Proc. IEEE Pacific Rim Conf. Commun., Comput. Signal Process. (PACRIM)</w:t>
+      </w:r>
+      <w:r>
+        <w:rPr>
+          <w:sz w:val="24"/>
+          <w:szCs w:val="24"/>
+        </w:rPr>
+        <w:t>, 2013, pp. 15–19.</w:t>
+      </w:r>
+    </w:p>
+    <w:p>
+      <w:pPr>
+        <w:pStyle w:val="BodyText"/>
+        <w:spacing w:lineRule="auto" w:line="276"/>
         <w:jc w:val="both"/>
         <w:rPr>
           <w:sz w:val="24"/>
@@ -15411,12 +15526,28 @@
           <w:sz w:val="24"/>
           <w:szCs w:val="24"/>
         </w:rPr>
-        <w:t>[7] Y. Li and S. Manoharan, "A performance comparison of SQL and NoSQL databases," 2013 IEEE Pacific Rim Conference on Communications, Computers and Signal Processing (PACRIM), 2013, pp. 15-19.</w:t>
-      </w:r>
-    </w:p>
-    <w:p>
-      <w:pPr>
-        <w:pStyle w:val="Normal"/>
+        <w:t xml:space="preserve">[8] J. Tan, Y. Chen, and S. Jiao, "Visual Studio Code in Introductory Computer Science Course: An Experience Report," in </w:t>
+      </w:r>
+      <w:r>
+        <w:rPr>
+          <w:i/>
+          <w:sz w:val="24"/>
+          <w:szCs w:val="24"/>
+        </w:rPr>
+        <w:t>Proc. ACM Tech. Symp. Comput. Sci. Educ. (SIGCSE)</w:t>
+      </w:r>
+      <w:r>
+        <w:rPr>
+          <w:sz w:val="24"/>
+          <w:szCs w:val="24"/>
+        </w:rPr>
+        <w:t>, 2023.</w:t>
+      </w:r>
+    </w:p>
+    <w:p>
+      <w:pPr>
+        <w:pStyle w:val="BodyText"/>
+        <w:spacing w:lineRule="auto" w:line="276"/>
         <w:jc w:val="both"/>
         <w:rPr>
           <w:sz w:val="24"/>
@@ -15428,12 +15559,28 @@
           <w:sz w:val="24"/>
           <w:szCs w:val="24"/>
         </w:rPr>
-        <w:t>[8] J. Tan, Y. Chen, and S. Jiao, "Visual Studio Code in Introductory Computer Science Course: An Experience Report," ACM, 2023.</w:t>
-      </w:r>
-    </w:p>
-    <w:p>
-      <w:pPr>
-        <w:pStyle w:val="Normal"/>
+        <w:t xml:space="preserve">[9] IEEE Computer Society, "The Impact of AI on Productivity and Code in Software Engineering," </w:t>
+      </w:r>
+      <w:r>
+        <w:rPr>
+          <w:i/>
+          <w:sz w:val="24"/>
+          <w:szCs w:val="24"/>
+        </w:rPr>
+        <w:t>IEEE Softw.</w:t>
+      </w:r>
+      <w:r>
+        <w:rPr>
+          <w:sz w:val="24"/>
+          <w:szCs w:val="24"/>
+        </w:rPr>
+        <w:t>, vol. 41, no. 1, 2024.</w:t>
+      </w:r>
+    </w:p>
+    <w:p>
+      <w:pPr>
+        <w:pStyle w:val="BodyText"/>
+        <w:spacing w:lineRule="auto" w:line="276"/>
         <w:jc w:val="both"/>
         <w:rPr>
           <w:sz w:val="24"/>
@@ -15445,12 +15592,28 @@
           <w:sz w:val="24"/>
           <w:szCs w:val="24"/>
         </w:rPr>
-        <w:t>[9] IEEE Computer Society, "The Impact of AI on Productivity and Code in Software Engineering," IEEE, 2024.</w:t>
-      </w:r>
-    </w:p>
-    <w:p>
-      <w:pPr>
-        <w:pStyle w:val="Normal"/>
+        <w:t xml:space="preserve">[10] B. Perez et al., "Learning the State Machine Behind a Modal Text Editor: The (Neo)Vim Case Study," </w:t>
+      </w:r>
+      <w:r>
+        <w:rPr>
+          <w:i/>
+          <w:sz w:val="24"/>
+          <w:szCs w:val="24"/>
+        </w:rPr>
+        <w:t>IEEE Trans. Softw. Eng.</w:t>
+      </w:r>
+      <w:r>
+        <w:rPr>
+          <w:sz w:val="24"/>
+          <w:szCs w:val="24"/>
+        </w:rPr>
+        <w:t>, 2024.</w:t>
+      </w:r>
+    </w:p>
+    <w:p>
+      <w:pPr>
+        <w:pStyle w:val="BodyText"/>
+        <w:spacing w:lineRule="auto" w:line="276"/>
         <w:jc w:val="both"/>
         <w:rPr>
           <w:sz w:val="24"/>
@@ -15462,12 +15625,28 @@
           <w:sz w:val="24"/>
           <w:szCs w:val="24"/>
         </w:rPr>
-        <w:t>[10] B. Perez et al., "Learning the State Machine Behind a Modal Text Editor: The (Neo)Vim Case Study," IEEE, 2024.</w:t>
-      </w:r>
-    </w:p>
-    <w:p>
-      <w:pPr>
-        <w:pStyle w:val="Normal"/>
+        <w:t xml:space="preserve">[11] M. Wang et al., "How Developers Choose Debugging Strategies for Challenging Web Application Defects," in </w:t>
+      </w:r>
+      <w:r>
+        <w:rPr>
+          <w:i/>
+          <w:sz w:val="24"/>
+          <w:szCs w:val="24"/>
+        </w:rPr>
+        <w:t>Proc. IEEE/ACM 46th Int. Conf. Softw. Eng. (ICSE)</w:t>
+      </w:r>
+      <w:r>
+        <w:rPr>
+          <w:sz w:val="24"/>
+          <w:szCs w:val="24"/>
+        </w:rPr>
+        <w:t>, 2024.</w:t>
+      </w:r>
+    </w:p>
+    <w:p>
+      <w:pPr>
+        <w:pStyle w:val="BodyText"/>
+        <w:spacing w:lineRule="auto" w:line="276"/>
         <w:jc w:val="both"/>
         <w:rPr>
           <w:sz w:val="24"/>
@@ -15479,12 +15658,28 @@
           <w:sz w:val="24"/>
           <w:szCs w:val="24"/>
         </w:rPr>
-        <w:t>[11] M. Wang et al., "How Developers Choose Debugging Strategies for Challenging Web Application Defects," ACM, 2024.</w:t>
-      </w:r>
-    </w:p>
-    <w:p>
-      <w:pPr>
-        <w:pStyle w:val="Normal"/>
+        <w:t xml:space="preserve">[12] N. Dinh et al., "GitHub Analytics to Support Collaboration in Software Engineering Teams," </w:t>
+      </w:r>
+      <w:r>
+        <w:rPr>
+          <w:i/>
+          <w:sz w:val="24"/>
+          <w:szCs w:val="24"/>
+        </w:rPr>
+        <w:t>IEEE Trans. Comput. Social Syst.</w:t>
+      </w:r>
+      <w:r>
+        <w:rPr>
+          <w:sz w:val="24"/>
+          <w:szCs w:val="24"/>
+        </w:rPr>
+        <w:t>, 2024.</w:t>
+      </w:r>
+    </w:p>
+    <w:p>
+      <w:pPr>
+        <w:pStyle w:val="BodyText"/>
+        <w:spacing w:lineRule="auto" w:line="276"/>
         <w:jc w:val="both"/>
         <w:rPr>
           <w:sz w:val="24"/>
@@ -15496,12 +15691,28 @@
           <w:sz w:val="24"/>
           <w:szCs w:val="24"/>
         </w:rPr>
-        <w:t>[12] N. Dinh et al., "GitHub Analytics to Support Collaboration in Software Engineering Teams," IEEE, 2024.</w:t>
-      </w:r>
-    </w:p>
-    <w:p>
-      <w:pPr>
-        <w:pStyle w:val="Normal"/>
+        <w:t xml:space="preserve">[13] P. Spinellis, "Git," </w:t>
+      </w:r>
+      <w:r>
+        <w:rPr>
+          <w:i/>
+          <w:sz w:val="24"/>
+          <w:szCs w:val="24"/>
+        </w:rPr>
+        <w:t>IEEE Softw.</w:t>
+      </w:r>
+      <w:r>
+        <w:rPr>
+          <w:sz w:val="24"/>
+          <w:szCs w:val="24"/>
+        </w:rPr>
+        <w:t>, vol. 29, no. 3, pp. 100–101, May–Jun. 2012.</w:t>
+      </w:r>
+    </w:p>
+    <w:p>
+      <w:pPr>
+        <w:pStyle w:val="BodyText"/>
+        <w:spacing w:lineRule="auto" w:line="276"/>
         <w:jc w:val="both"/>
         <w:rPr>
           <w:sz w:val="24"/>
@@ -15513,12 +15724,28 @@
           <w:sz w:val="24"/>
           <w:szCs w:val="24"/>
         </w:rPr>
-        <w:t>[13] P. Spinellis, "Git," IEEE Software, vol. 29, no. 3, pp. 100-101, 2012.</w:t>
-      </w:r>
-    </w:p>
-    <w:p>
-      <w:pPr>
-        <w:pStyle w:val="Normal"/>
+        <w:t xml:space="preserve">[14] J. Nurmi et al., "A JSON Token-Based Authentication and Access Management Schema for Cloud SaaS Applications," in </w:t>
+      </w:r>
+      <w:r>
+        <w:rPr>
+          <w:i/>
+          <w:sz w:val="24"/>
+          <w:szCs w:val="24"/>
+        </w:rPr>
+        <w:t>Proc. IEEE 5th Int. Conf. Future Internet of Things and Cloud (FiCloud)</w:t>
+      </w:r>
+      <w:r>
+        <w:rPr>
+          <w:sz w:val="24"/>
+          <w:szCs w:val="24"/>
+        </w:rPr>
+        <w:t>, 2017, pp. 3–10.</w:t>
+      </w:r>
+    </w:p>
+    <w:p>
+      <w:pPr>
+        <w:pStyle w:val="BodyText"/>
+        <w:spacing w:lineRule="auto" w:line="276"/>
         <w:jc w:val="both"/>
         <w:rPr>
           <w:sz w:val="24"/>
@@ -15530,12 +15757,28 @@
           <w:sz w:val="24"/>
           <w:szCs w:val="24"/>
         </w:rPr>
-        <w:t>[14] J. Nurmi et al., "A JSON Token-Based Authentication and Access Management Schema for Cloud SaaS Applications," IEEE Xplore, 2017.</w:t>
-      </w:r>
-    </w:p>
-    <w:p>
-      <w:pPr>
-        <w:pStyle w:val="Normal"/>
+        <w:t xml:space="preserve">[15] R. M. Ahmed and M. Mahmood, "An authentication based scheme for applications using JSON web token," in </w:t>
+      </w:r>
+      <w:r>
+        <w:rPr>
+          <w:i/>
+          <w:sz w:val="24"/>
+          <w:szCs w:val="24"/>
+        </w:rPr>
+        <w:t>Proc. 2nd Int. Conf. Comput. Inf. Sci. (ICCIS)</w:t>
+      </w:r>
+      <w:r>
+        <w:rPr>
+          <w:sz w:val="24"/>
+          <w:szCs w:val="24"/>
+        </w:rPr>
+        <w:t>, 2019, pp. 1–6.</w:t>
+      </w:r>
+    </w:p>
+    <w:p>
+      <w:pPr>
+        <w:pStyle w:val="BodyText"/>
+        <w:spacing w:lineRule="auto" w:line="276"/>
         <w:jc w:val="both"/>
         <w:rPr>
           <w:sz w:val="24"/>
@@ -15547,12 +15790,29 @@
           <w:sz w:val="24"/>
           <w:szCs w:val="24"/>
         </w:rPr>
-        <w:t>[15] R. M. Ahmed and M. Mahmood, "An authentication based scheme for applications using JSON web token," ResearchGate/IEEE, 2019.</w:t>
-      </w:r>
-    </w:p>
-    <w:p>
-      <w:pPr>
-        <w:pStyle w:val="Normal"/>
+        <w:t xml:space="preserve">[16] V. M. Ganeshan, "Web Development Using ReactJS: Virtual DOM Performance in SPAs," in </w:t>
+      </w:r>
+      <w:r>
+        <w:rPr>
+          <w:i/>
+          <w:sz w:val="24"/>
+          <w:szCs w:val="24"/>
+        </w:rPr>
+        <w:t>Proc. 5th Int. Conf. Adv. Comput., Commun. Control Netw. (ICAC3N)</w:t>
+      </w:r>
+      <w:r>
+        <w:rPr>
+          <w:sz w:val="24"/>
+          <w:szCs w:val="24"/>
+        </w:rPr>
+        <w:t>, 2023.</w:t>
+      </w:r>
+    </w:p>
+    <w:p>
+      <w:pPr>
+        <w:pStyle w:val="BodyText"/>
+        <w:bidi w:val="0"/>
+        <w:spacing w:lineRule="auto" w:line="276"/>
         <w:jc w:val="both"/>
         <w:rPr>
           <w:sz w:val="24"/>
@@ -15564,7 +15824,23 @@
           <w:sz w:val="24"/>
           <w:szCs w:val="24"/>
         </w:rPr>
-        <w:t>[16] V. M. Ganeshan, "Web Development Using ReactJS: Virtual DOM Performance in SPAs," 2023 5th International Conference on Advances in Computing (ICAC3N), 2023.</w:t>
+      </w:r>
+    </w:p>
+    <w:p>
+      <w:pPr>
+        <w:pStyle w:val="Normal"/>
+        <w:bidi w:val="0"/>
+        <w:jc w:val="both"/>
+        <w:rPr>
+          <w:sz w:val="24"/>
+          <w:szCs w:val="24"/>
+        </w:rPr>
+      </w:pPr>
+      <w:r>
+        <w:rPr>
+          <w:sz w:val="24"/>
+          <w:szCs w:val="24"/>
+        </w:rPr>
       </w:r>
       <w:r>
         <w:br w:type="page"/>

</xml_diff>